<commit_message>
Kambag'allik kurs ishi: nomlar jadval/rasm ustida, xulosa alohida varaqda, kirishga snoska
Co-Authored-By: Claude Opus 5.5 <noreply@anthropic.com>
Claude-Session: https://claude.ai/code/session_01SPUXgDHyaKJrV6o5CiPGr8
</commit_message>
<xml_diff>
--- a/kurs_ishi/kurs_ishi_kambagallik_tahrirlangan.docx
+++ b/kurs_ishi/kurs_ishi_kambagallik_tahrirlangan.docx
@@ -584,6 +584,29 @@
           <w:rFonts w:ascii="Times New Roman" w:hAnsi="Times New Roman"/>
           <w:sz w:val="28"/>
         </w:rPr>
+        <w:t xml:space="preserve">Prezident Sh.M.Mirziyoyev Oliy Majlisga Murojaatnomasida taʼkidlaganidek, «Kambagʻallikni qisqartirish – bu aholida tadbirkorlik ruhini uygʻotish, inson salohiyatini toʻliq roʻyobga chiqarish, yangi ish oʻrinlarini yaratish boʻyicha kompleks iqtisodiy va ijtimoiy siyosatni amalga oshirish demakdir».</w:t>
+      </w:r>
+      <w:r>
+        <w:rPr>
+          <w:rStyle w:val="FootnoteReference"/>
+          <w:vertAlign w:val="superscript"/>
+          <w:sz w:val="20"/>
+          <w:szCs w:val="20"/>
+        </w:rPr>
+        <w:footnoteReference w:id="33"/>
+      </w:r>
+      <w:r>
+        <w:rPr>
+          <w:rFonts w:ascii="Times New Roman" w:hAnsi="Times New Roman"/>
+          <w:sz w:val="28"/>
+        </w:rPr>
+        <w:t xml:space="preserve"> </w:t>
+      </w:r>
+      <w:r>
+        <w:rPr>
+          <w:rFonts w:ascii="Times New Roman" w:hAnsi="Times New Roman"/>
+          <w:sz w:val="28"/>
+        </w:rPr>
         <w:t>Oʻzbekiston iqtisodiyotini modernizatsiya qilish va aholi turmush darajasini oshirish jarayonida kambagʻallikni kamaytirish strategik ahamiyat kasb etmoqda. Mavjud ijtimoiy-iqtisodiy sharoitlar, jumladan, hududiy rivojlanishdagi nomutanosibliklar, bandlik darajasining oʻzgaruvchanligi va global iqtisodiyotdagi notinchliklar ushbu muammoning murakkabligini yanada kuchaytiradi. Shu sababli, xorijiy davlatlarning kambagʻallikni qisqartirish boʻyicha qoʻllagan samarali mexanizmlari va dasturlarini tahlil qilish hamda ularni Oʻzbekistonning milliy xususiyatlari va rivojlanish bosqichidan kelib chiqqan holda amaliyotga tatbiq etish yoʻllarini izlash dolzarb vazifadir. Bu kurs ishida Oʻzbekistonda kambagʻallikni kamaytirishga qaratilgan siyosatlarni takomillashtirish uchun xorijiy tajribalarni oʻrganish va moslashtirish masalalariga urgʻu beriladi.</w:t>
       </w:r>
     </w:p>
@@ -782,6 +805,21 @@
           <w:szCs w:val="20"/>
         </w:rPr>
         <w:footnoteReference w:id="2"/>
+      </w:r>
+    </w:p>
+    <w:p>
+      <w:pPr>
+        <w:keepNext/>
+        <w:spacing w:before="0" w:after="0"/>
+        <w:jc w:val="center"/>
+      </w:pPr>
+      <w:r>
+        <w:rPr>
+          <w:rFonts w:ascii="Times New Roman" w:hAnsi="Times New Roman"/>
+          <w:b/>
+          <w:sz w:val="24"/>
+        </w:rPr>
+        <w:t xml:space="preserve">1-jadval. Xorijiy mamlakatlarda kambagʻallikni qisqartirish dasturlarining qiyosiy tavsifi</w:t>
       </w:r>
     </w:p>
     <w:tbl>
@@ -1205,20 +1243,6 @@
     </w:tbl>
     <w:p>
       <w:pPr>
-        <w:spacing w:before="0" w:after="0"/>
-        <w:jc w:val="center"/>
-      </w:pPr>
-      <w:r>
-        <w:rPr>
-          <w:rFonts w:ascii="Times New Roman" w:hAnsi="Times New Roman"/>
-          <w:b/>
-          <w:sz w:val="24"/>
-        </w:rPr>
-        <w:t xml:space="preserve">1-jadval. Xorijiy mamlakatlarda kambagʻallikni qisqartirish dasturlarining qiyosiy tavsifi</w:t>
-      </w:r>
-    </w:p>
-    <w:p>
-      <w:pPr>
         <w:spacing w:line="360" w:lineRule="auto" w:after="0" w:before="0"/>
         <w:ind w:firstLine="720"/>
         <w:jc w:val="both"/>
@@ -1367,6 +1391,21 @@
           <w:szCs w:val="20"/>
         </w:rPr>
         <w:footnoteReference w:id="8"/>
+      </w:r>
+    </w:p>
+    <w:p>
+      <w:pPr>
+        <w:keepNext/>
+        <w:spacing w:before="0" w:after="0"/>
+        <w:jc w:val="center"/>
+      </w:pPr>
+      <w:r>
+        <w:rPr>
+          <w:rFonts w:ascii="Times New Roman" w:hAnsi="Times New Roman"/>
+          <w:b/>
+          <w:sz w:val="24"/>
+        </w:rPr>
+        <w:t>1-rasm. Rivojlangan va rivojlanayotgan mamlakatlarda kambagʻallik darajasining oʻzgarish tendensiyasi (Prognoz)</w:t>
       </w:r>
     </w:p>
     <w:p>
@@ -1411,20 +1450,6 @@
     </w:p>
     <w:p>
       <w:pPr>
-        <w:spacing w:before="0" w:after="0"/>
-        <w:jc w:val="center"/>
-      </w:pPr>
-      <w:r>
-        <w:rPr>
-          <w:rFonts w:ascii="Times New Roman" w:hAnsi="Times New Roman"/>
-          <w:b/>
-          <w:sz w:val="24"/>
-        </w:rPr>
-        <w:t>1-rasm. Rivojlangan va rivojlanayotgan mamlakatlarda kambagʻallik darajasining oʻzgarish tendensiyasi (Prognoz)</w:t>
-      </w:r>
-    </w:p>
-    <w:p>
-      <w:pPr>
         <w:spacing w:line="360" w:lineRule="auto" w:after="0" w:before="0"/>
         <w:ind w:firstLine="720"/>
         <w:jc w:val="both"/>
@@ -1449,6 +1474,21 @@
           <w:sz w:val="26"/>
         </w:rPr>
         <w:t>Ushbu jarayonlarning umumiy tuzilmasini quyidagi diagramma ko'rsatadi:</w:t>
+      </w:r>
+    </w:p>
+    <w:p>
+      <w:pPr>
+        <w:keepNext/>
+        <w:spacing w:before="0" w:after="0"/>
+        <w:jc w:val="center"/>
+      </w:pPr>
+      <w:r>
+        <w:rPr>
+          <w:rFonts w:ascii="Times New Roman" w:hAnsi="Times New Roman"/>
+          <w:b/>
+          <w:sz w:val="24"/>
+        </w:rPr>
+        <w:t>2-rasm. Dunyoning rivojlangan va rivojlanayotgan mamlakatlarida kambagʻallikni qisqartirishning samarali strategiyalari va mexanizmlari qanday?</w:t>
       </w:r>
     </w:p>
     <w:p>
@@ -1493,20 +1533,6 @@
     </w:p>
     <w:p>
       <w:pPr>
-        <w:spacing w:before="0" w:after="0"/>
-        <w:jc w:val="center"/>
-      </w:pPr>
-      <w:r>
-        <w:rPr>
-          <w:rFonts w:ascii="Times New Roman" w:hAnsi="Times New Roman"/>
-          <w:b/>
-          <w:sz w:val="24"/>
-        </w:rPr>
-        <w:t>2-rasm. Dunyoning rivojlangan va rivojlanayotgan mamlakatlarida kambagʻallikni qisqartirishning samarali strategiyalari va mexanizmlari qanday?</w:t>
-      </w:r>
-    </w:p>
-    <w:p>
-      <w:pPr>
         <w:spacing w:line="360" w:lineRule="auto" w:after="0" w:before="0"/>
         <w:ind w:firstLine="720"/>
         <w:jc w:val="both"/>
@@ -1577,6 +1603,21 @@
           <w:szCs w:val="20"/>
         </w:rPr>
         <w:footnoteReference w:id="10"/>
+      </w:r>
+    </w:p>
+    <w:p>
+      <w:pPr>
+        <w:keepNext/>
+        <w:spacing w:before="0" w:after="0"/>
+        <w:jc w:val="center"/>
+      </w:pPr>
+      <w:r>
+        <w:rPr>
+          <w:rFonts w:ascii="Times New Roman" w:hAnsi="Times New Roman"/>
+          <w:b/>
+          <w:sz w:val="24"/>
+        </w:rPr>
+        <w:t xml:space="preserve">2-jadval. Oʻzbekistonda kambagʻallikni qisqartirishga qaratilgan asosiy institutsional mexanizmlar</w:t>
       </w:r>
     </w:p>
     <w:tbl>
@@ -1934,20 +1975,6 @@
     </w:tbl>
     <w:p>
       <w:pPr>
-        <w:spacing w:before="0" w:after="0"/>
-        <w:jc w:val="center"/>
-      </w:pPr>
-      <w:r>
-        <w:rPr>
-          <w:rFonts w:ascii="Times New Roman" w:hAnsi="Times New Roman"/>
-          <w:b/>
-          <w:sz w:val="24"/>
-        </w:rPr>
-        <w:t xml:space="preserve">2-jadval. Oʻzbekistonda kambagʻallikni qisqartirishga qaratilgan asosiy institutsional mexanizmlar</w:t>
-      </w:r>
-    </w:p>
-    <w:p>
-      <w:pPr>
         <w:spacing w:line="360" w:lineRule="auto" w:after="0" w:before="0"/>
         <w:ind w:firstLine="720"/>
         <w:jc w:val="both"/>
@@ -2073,6 +2100,21 @@
           <w:szCs w:val="20"/>
         </w:rPr>
         <w:footnoteReference w:id="15"/>
+      </w:r>
+    </w:p>
+    <w:p>
+      <w:pPr>
+        <w:keepNext/>
+        <w:spacing w:before="0" w:after="0"/>
+        <w:jc w:val="center"/>
+      </w:pPr>
+      <w:r>
+        <w:rPr>
+          <w:rFonts w:ascii="Times New Roman" w:hAnsi="Times New Roman"/>
+          <w:b/>
+          <w:sz w:val="24"/>
+        </w:rPr>
+        <w:t xml:space="preserve">3-jadval. Oʻzbekistonda kambagʻallik darajasining hududlar kesimida taqsimlanishi (2023-yil yakuni boʻyicha prognoz)</w:t>
       </w:r>
     </w:p>
     <w:tbl>
@@ -2544,20 +2586,6 @@
     </w:tbl>
     <w:p>
       <w:pPr>
-        <w:spacing w:before="0" w:after="0"/>
-        <w:jc w:val="center"/>
-      </w:pPr>
-      <w:r>
-        <w:rPr>
-          <w:rFonts w:ascii="Times New Roman" w:hAnsi="Times New Roman"/>
-          <w:b/>
-          <w:sz w:val="24"/>
-        </w:rPr>
-        <w:t xml:space="preserve">3-jadval. Oʻzbekistonda kambagʻallik darajasining hududlar kesimida taqsimlanishi (2023-yil yakuni boʻyicha prognoz)</w:t>
-      </w:r>
-    </w:p>
-    <w:p>
-      <w:pPr>
         <w:spacing w:line="360" w:lineRule="auto" w:after="0" w:before="0"/>
         <w:ind w:firstLine="720"/>
         <w:jc w:val="both"/>
@@ -2582,6 +2610,21 @@
           <w:sz w:val="26"/>
         </w:rPr>
         <w:t>Bu omillarni Xorijiy mamlakatlar tajribasi bilan solishtirish quyidagi jadvalda aks ettirilgan:</w:t>
+      </w:r>
+    </w:p>
+    <w:p>
+      <w:pPr>
+        <w:keepNext/>
+        <w:spacing w:before="0" w:after="0"/>
+        <w:jc w:val="center"/>
+      </w:pPr>
+      <w:r>
+        <w:rPr>
+          <w:rFonts w:ascii="Times New Roman" w:hAnsi="Times New Roman"/>
+          <w:b/>
+          <w:sz w:val="24"/>
+        </w:rPr>
+        <w:t xml:space="preserve">4-jadval. Oʻzbekistonda kambagʻallikning hozirgi holati, uning tarkibiy omillari va rivojlanish tendensiyalarini baholash</w:t>
       </w:r>
     </w:p>
     <w:tbl>
@@ -2873,20 +2916,6 @@
     </w:tbl>
     <w:p>
       <w:pPr>
-        <w:spacing w:before="0" w:after="0"/>
-        <w:jc w:val="center"/>
-      </w:pPr>
-      <w:r>
-        <w:rPr>
-          <w:rFonts w:ascii="Times New Roman" w:hAnsi="Times New Roman"/>
-          <w:b/>
-          <w:sz w:val="24"/>
-        </w:rPr>
-        <w:t xml:space="preserve">4-jadval. Oʻzbekistonda kambagʻallikning hozirgi holati, uning tarkibiy omillari va rivojlanish tendensiyalarini baholash</w:t>
-      </w:r>
-    </w:p>
-    <w:p>
-      <w:pPr>
         <w:spacing w:line="360" w:lineRule="auto" w:after="0" w:before="0"/>
         <w:ind w:firstLine="720"/>
         <w:jc w:val="both"/>
@@ -3132,6 +3161,21 @@
           <w:sz w:val="26"/>
         </w:rPr>
         <w:t>Bu yoʻnalishlar boʻyicha asosiy maʼlumotlar jadvalda aks etgan:</w:t>
+      </w:r>
+    </w:p>
+    <w:p>
+      <w:pPr>
+        <w:keepNext/>
+        <w:spacing w:before="0" w:after="0"/>
+        <w:jc w:val="center"/>
+      </w:pPr>
+      <w:r>
+        <w:rPr>
+          <w:rFonts w:ascii="Times New Roman" w:hAnsi="Times New Roman"/>
+          <w:b/>
+          <w:sz w:val="24"/>
+        </w:rPr>
+        <w:t xml:space="preserve">5-jadval. Xorijiy tajribalarni Oʻzbekiston iqtisodiy-ijtimoiy sharoitlariga moslashtirishning asosiy yoʻnalishlari va dastlabki qadamlari</w:t>
       </w:r>
     </w:p>
     <w:tbl>
@@ -3423,20 +3467,6 @@
     </w:tbl>
     <w:p>
       <w:pPr>
-        <w:spacing w:before="0" w:after="0"/>
-        <w:jc w:val="center"/>
-      </w:pPr>
-      <w:r>
-        <w:rPr>
-          <w:rFonts w:ascii="Times New Roman" w:hAnsi="Times New Roman"/>
-          <w:b/>
-          <w:sz w:val="24"/>
-        </w:rPr>
-        <w:t xml:space="preserve">5-jadval. Xorijiy tajribalarni Oʻzbekiston iqtisodiy-ijtimoiy sharoitlariga moslashtirishning asosiy yoʻnalishlari va dastlabki qadamlari</w:t>
-      </w:r>
-    </w:p>
-    <w:p>
-      <w:pPr>
         <w:spacing w:line="360" w:lineRule="auto" w:after="0" w:before="0"/>
         <w:ind w:firstLine="720"/>
         <w:jc w:val="both"/>
@@ -3649,6 +3679,7 @@
     </w:p>
     <w:p>
       <w:pPr>
+        <w:pageBreakBefore/>
         <w:spacing w:before="0" w:after="0"/>
         <w:jc w:val="center"/>
       </w:pPr>
@@ -4875,6 +4906,32 @@
           <w:rFonts w:ascii="Times New Roman" w:hAnsi="Times New Roman" w:cs="Times New Roman"/>
         </w:rPr>
         <w:t xml:space="preserve"> Ochilov Y.A. O'zbekistonda ijtimoiy himoya tizimini takomillashtirish. Toshkent: Adabiyot uchqunlari, 2022.</w:t>
+      </w:r>
+    </w:p>
+  </w:footnote>
+  <w:footnote w:id="33">
+    <w:p>
+      <w:pPr>
+        <w:pStyle w:val="FootnoteText"/>
+        <w:spacing w:after="0" w:line="240" w:lineRule="auto"/>
+        <w:jc w:val="both"/>
+      </w:pPr>
+      <w:r>
+        <w:rPr>
+          <w:rStyle w:val="FootnoteReference"/>
+          <w:vertAlign w:val="superscript"/>
+          <w:sz w:val="20"/>
+          <w:szCs w:val="20"/>
+        </w:rPr>
+        <w:footnoteRef/>
+      </w:r>
+      <w:r>
+        <w:rPr>
+          <w:rFonts w:ascii="Times New Roman" w:hAnsi="Times New Roman" w:cs="Times New Roman"/>
+          <w:sz w:val="20"/>
+          <w:szCs w:val="20"/>
+        </w:rPr>
+        <w:t xml:space="preserve"> Oʻzbekiston Respublikasi Prezidenti Sh.M.Mirziyoyevning Oliy Majlisga Murojaatnomasi. 2020-yil 24-yanvar. // www.president.uz</w:t>
       </w:r>
     </w:p>
   </w:footnote>

</xml_diff>